<commit_message>
Update session record: project complete and published
Rewrites the status section (the .pkt is now built, committed and pushed),
adds the build execution, paste tooling and publication chronology, and
replaces next steps with the four optional items that remain.

Co-Authored-By: Claude Opus 5 <noreply@anthropic.com>
</commit_message>
<xml_diff>
--- a/docs/Project-Session-Record.docx
+++ b/docs/Project-Session-Record.docx
@@ -72,7 +72,7 @@
           <w:sz w:val="20"/>
           <w:szCs w:val="20"/>
         </w:rPr>
-        <w:t xml:space="preserve">Session record dated 25 August 2026</w:t>
+        <w:t xml:space="preserve">Session record - project complete, published 27 August 2026</w:t>
       </w:r>
     </w:p>
     <w:p>
@@ -4893,7 +4893,7 @@
           <w:sz w:val="21"/>
           <w:szCs w:val="21"/>
         </w:rPr>
-        <w:t xml:space="preserve">Twenty-five files, all present in the repository and pushed to GitHub.</w:t>
+        <w:t xml:space="preserve">Sixty files, all present in the repository and pushed to GitHub.</w:t>
       </w:r>
     </w:p>
     <w:tbl>
@@ -5836,6 +5836,56 @@
                 <w:sz w:val="18"/>
                 <w:szCs w:val="18"/>
               </w:rPr>
+              <w:t xml:space="preserve">packet-tracer/university-network.pkt</w:t>
+            </w:r>
+          </w:p>
+        </w:tc>
+        <w:tc>
+          <w:tcPr>
+            <w:tcW w:type="dxa" w:w="6138"/>
+            <w:shd w:fill="FFFFFF" w:val="clear"/>
+            <w:tcMar>
+              <w:top w:type="dxa" w:w="60"/>
+              <w:left w:type="dxa" w:w="100"/>
+              <w:bottom w:type="dxa" w:w="60"/>
+              <w:right w:type="dxa" w:w="100"/>
+            </w:tcMar>
+          </w:tcPr>
+          <w:p>
+            <w:r>
+              <w:rPr>
+                <w:b w:val="false"/>
+                <w:bCs w:val="false"/>
+                <w:color w:val="000000"/>
+                <w:sz w:val="18"/>
+                <w:szCs w:val="18"/>
+              </w:rPr>
+              <w:t xml:space="preserve">The built simulation: 49 devices, 48 links, all configs saved. Built on PT 9.0.1</w:t>
+            </w:r>
+          </w:p>
+        </w:tc>
+      </w:tr>
+      <w:tr>
+        <w:tc>
+          <w:tcPr>
+            <w:tcW w:type="dxa" w:w="2888"/>
+            <w:shd w:fill="FFFFFF" w:val="clear"/>
+            <w:tcMar>
+              <w:top w:type="dxa" w:w="60"/>
+              <w:left w:type="dxa" w:w="100"/>
+              <w:bottom w:type="dxa" w:w="60"/>
+              <w:right w:type="dxa" w:w="100"/>
+            </w:tcMar>
+          </w:tcPr>
+          <w:p>
+            <w:r>
+              <w:rPr>
+                <w:b w:val="false"/>
+                <w:bCs w:val="false"/>
+                <w:color w:val="000000"/>
+                <w:sz w:val="18"/>
+                <w:szCs w:val="18"/>
+              </w:rPr>
               <w:t xml:space="preserve">packet-tracer/README.md</w:t>
             </w:r>
           </w:p>
@@ -5860,7 +5910,57 @@
                 <w:sz w:val="18"/>
                 <w:szCs w:val="18"/>
               </w:rPr>
-              <w:t xml:space="preserve">Explains what belongs in the folder and the two rules for handling the .pkt</w:t>
+              <w:t xml:space="preserve">How to open and verify the simulation, and the fallbacks for a version mismatch</w:t>
+            </w:r>
+          </w:p>
+        </w:tc>
+      </w:tr>
+      <w:tr>
+        <w:tc>
+          <w:tcPr>
+            <w:tcW w:type="dxa" w:w="2888"/>
+            <w:shd w:fill="FFFFFF" w:val="clear"/>
+            <w:tcMar>
+              <w:top w:type="dxa" w:w="60"/>
+              <w:left w:type="dxa" w:w="100"/>
+              <w:bottom w:type="dxa" w:w="60"/>
+              <w:right w:type="dxa" w:w="100"/>
+            </w:tcMar>
+          </w:tcPr>
+          <w:p>
+            <w:r>
+              <w:rPr>
+                <w:b w:val="false"/>
+                <w:bCs w:val="false"/>
+                <w:color w:val="000000"/>
+                <w:sz w:val="18"/>
+                <w:szCs w:val="18"/>
+              </w:rPr>
+              <w:t xml:space="preserve">paste/ (31 files + README)</w:t>
+            </w:r>
+          </w:p>
+        </w:tc>
+        <w:tc>
+          <w:tcPr>
+            <w:tcW w:type="dxa" w:w="6138"/>
+            <w:shd w:fill="FFFFFF" w:val="clear"/>
+            <w:tcMar>
+              <w:top w:type="dxa" w:w="60"/>
+              <w:left w:type="dxa" w:w="100"/>
+              <w:bottom w:type="dxa" w:w="60"/>
+              <w:right w:type="dxa" w:w="100"/>
+            </w:tcMar>
+          </w:tcPr>
+          <w:p>
+            <w:r>
+              <w:rPr>
+                <w:b w:val="false"/>
+                <w:bCs w:val="false"/>
+                <w:color w:val="000000"/>
+                <w:sz w:val="18"/>
+                <w:szCs w:val="18"/>
+              </w:rPr>
+              <w:t xml:space="preserve">Comment-stripped config chunks, split at the RSA prompt, one paste operation each</w:t>
             </w:r>
           </w:p>
         </w:tc>
@@ -7297,11 +7397,158 @@
     </w:p>
     <w:p>
       <w:pPr>
+        <w:pStyle w:val="Heading2"/>
+        <w:spacing w:after="120" w:before="280"/>
+      </w:pPr>
+      <w:r>
+        <w:t xml:space="preserve">9.6 Build execution</w:t>
+      </w:r>
+    </w:p>
+    <w:p>
+      <w:pPr>
+        <w:spacing w:after="120" w:line="276"/>
+      </w:pPr>
+      <w:r>
+        <w:rPr>
+          <w:sz w:val="21"/>
+          <w:szCs w:val="21"/>
+        </w:rPr>
+        <w:t xml:space="preserve">The simulation was built by hand in the Packet Tracer GUI. Forty-nine devices were placed and renamed, forty-eight cables were run, and the ten device configurations were applied. Cabling was deliberately completed before any switch configuration was pasted, because port security uses sticky MAC learning and each port should see the correct device on its first frame.</w:t>
+      </w:r>
+    </w:p>
+    <w:p>
+      <w:pPr>
+        <w:spacing w:after="120" w:line="276"/>
+      </w:pPr>
+      <w:r>
+        <w:rPr>
+          <w:sz w:val="21"/>
+          <w:szCs w:val="21"/>
+        </w:rPr>
+        <w:t xml:space="preserve">Two checkpoints were used rather than testing only at the end. After the router configuration, the routing table was expected to list nine connected and nine local routes. After the distribution switch was configured, the router subinterfaces were re-checked and had moved to up and up, which is the first point at which the design can be said to work.</w:t>
+      </w:r>
+    </w:p>
+    <w:p>
+      <w:pPr>
+        <w:spacing w:after="120" w:line="276"/>
+      </w:pPr>
+      <w:r>
+        <w:rPr>
+          <w:sz w:val="21"/>
+          <w:szCs w:val="21"/>
+        </w:rPr>
+        <w:t xml:space="preserve">The servers were then given static addresses and services, the two portal pages were pasted into their HTTP index files, and the thirty-six PCs were switched to DHCP.</w:t>
+      </w:r>
+    </w:p>
+    <w:p>
+      <w:pPr>
+        <w:pStyle w:val="Heading2"/>
+        <w:spacing w:after="120" w:before="280"/>
+      </w:pPr>
+      <w:r>
+        <w:t xml:space="preserve">9.7 Paste tooling</w:t>
+      </w:r>
+    </w:p>
+    <w:p>
+      <w:pPr>
+        <w:spacing w:after="120" w:line="276"/>
+      </w:pPr>
+      <w:r>
+        <w:rPr>
+          <w:sz w:val="21"/>
+          <w:szCs w:val="21"/>
+        </w:rPr>
+        <w:t xml:space="preserve">Packet Tracer silently drops characters when a large block is pasted into a device CLI. The result is a configuration that looks correct on screen and does not work, which is a difficult failure to diagnose because nothing reports an error.</w:t>
+      </w:r>
+    </w:p>
+    <w:p>
+      <w:pPr>
+        <w:spacing w:after="120" w:line="276"/>
+      </w:pPr>
+      <w:r>
+        <w:rPr>
+          <w:sz w:val="21"/>
+          <w:szCs w:val="21"/>
+        </w:rPr>
+        <w:t xml:space="preserve">To remove that risk, the ten annotated configuration files were mechanically converted into thirty-one paste chunks in a new paste directory. Comments and blank lines were stripped, each chunk was limited to roughly seventy lines and cut only at top-level command boundaries, and every chunk was cut at exactly the line where the RSA key generation command interrupts a paste to ask for a key size.</w:t>
+      </w:r>
+    </w:p>
+    <w:p>
+      <w:pPr>
+        <w:spacing w:after="120" w:line="276"/>
+      </w:pPr>
+      <w:r>
+        <w:rPr>
+          <w:sz w:val="21"/>
+          <w:szCs w:val="21"/>
+        </w:rPr>
+        <w:t xml:space="preserve">Each chunk is then a single copy-and-paste with no scrolling or selection. The split was verified across all ten devices: every first chunk begins at enable, every RSA boundary lands correctly, and every final chunk ends at write memory. The annotated files in the configs folder remain the readable source of truth.</w:t>
+      </w:r>
+    </w:p>
+    <w:p>
+      <w:pPr>
+        <w:pStyle w:val="Heading2"/>
+        <w:spacing w:after="120" w:before="280"/>
+      </w:pPr>
+      <w:r>
+        <w:t xml:space="preserve">9.8 Publication and two authentication obstacles</w:t>
+      </w:r>
+    </w:p>
+    <w:p>
+      <w:pPr>
+        <w:spacing w:after="120" w:line="276"/>
+      </w:pPr>
+      <w:r>
+        <w:rPr>
+          <w:sz w:val="21"/>
+          <w:szCs w:val="21"/>
+        </w:rPr>
+        <w:t xml:space="preserve">The first obstacle was permission. The repository belongs to one GitHub account while the build machine was signed in as another, which held read access only. A push would have failed with a permission error that does not explain itself. The chosen resolution was to sign the CLI in as the repository owner, performed by the user rather than automated, since it involves another person's credentials.</w:t>
+      </w:r>
+    </w:p>
+    <w:p>
+      <w:pPr>
+        <w:spacing w:after="120" w:line="276"/>
+      </w:pPr>
+      <w:r>
+        <w:rPr>
+          <w:sz w:val="21"/>
+          <w:szCs w:val="21"/>
+        </w:rPr>
+        <w:t xml:space="preserve">The second obstacle was subtler and would have caused a confusing failure. Git and the GitHub CLI are separate programs with separate credential stores. The CLI was authenticated correctly, but Git was configured to use Git Credential Manager, which holds its own GitHub credential independently and could easily have supplied the wrong account. Pointing Git at the CLI token resolved it, so both now use the same active account.</w:t>
+      </w:r>
+    </w:p>
+    <w:p>
+      <w:pPr>
+        <w:spacing w:after="120" w:line="276"/>
+      </w:pPr>
+      <w:r>
+        <w:rPr>
+          <w:sz w:val="21"/>
+          <w:szCs w:val="21"/>
+        </w:rPr>
+        <w:t xml:space="preserve">The simulation file was then committed with the Packet Tracer version recorded in the commit message, and pushed. The push was verified by comparing the remote branch head against the local commit and confirming the file size on the remote.</w:t>
+      </w:r>
+    </w:p>
+    <w:p>
+      <w:pPr>
         <w:pStyle w:val="Heading1"/>
         <w:spacing w:after="160" w:before="360"/>
       </w:pPr>
       <w:r>
-        <w:t xml:space="preserve">10. Current Status</w:t>
+        <w:t xml:space="preserve">10. Final Status</w:t>
+      </w:r>
+    </w:p>
+    <w:p>
+      <w:pPr>
+        <w:spacing w:after="120" w:line="276"/>
+      </w:pPr>
+      <w:r>
+        <w:rPr>
+          <w:sz w:val="21"/>
+          <w:szCs w:val="21"/>
+        </w:rPr>
+        <w:t xml:space="preserve">The project is complete and published. Every item in the original brief has been delivered, the simulation has been built and verified, and all sixty files are on GitHub.</w:t>
       </w:r>
     </w:p>
     <w:tbl>
@@ -7317,8 +7564,8 @@
         </w:tblBorders>
       </w:tblPr>
       <w:tblGrid>
-        <w:gridCol w:w="4964"/>
-        <w:gridCol w:w="4062"/>
+        <w:gridCol w:w="5235"/>
+        <w:gridCol w:w="3791"/>
       </w:tblGrid>
       <w:tr>
         <w:trPr>
@@ -7326,7 +7573,7 @@
         </w:trPr>
         <w:tc>
           <w:tcPr>
-            <w:tcW w:type="dxa" w:w="4964"/>
+            <w:tcW w:type="dxa" w:w="5235"/>
             <w:shd w:fill="0B3D91" w:val="clear"/>
             <w:tcMar>
               <w:top w:type="dxa" w:w="60"/>
@@ -7344,13 +7591,13 @@
                 <w:sz w:val="18"/>
                 <w:szCs w:val="18"/>
               </w:rPr>
-              <w:t xml:space="preserve">Item</w:t>
-            </w:r>
-          </w:p>
-        </w:tc>
-        <w:tc>
-          <w:tcPr>
-            <w:tcW w:type="dxa" w:w="4062"/>
+              <w:t xml:space="preserve">Deliverable</w:t>
+            </w:r>
+          </w:p>
+        </w:tc>
+        <w:tc>
+          <w:tcPr>
+            <w:tcW w:type="dxa" w:w="3791"/>
             <w:shd w:fill="0B3D91" w:val="clear"/>
             <w:tcMar>
               <w:top w:type="dxa" w:w="60"/>
@@ -7376,31 +7623,31 @@
       <w:tr>
         <w:tc>
           <w:tcPr>
-            <w:tcW w:type="dxa" w:w="4964"/>
-            <w:shd w:fill="FFFFFF" w:val="clear"/>
-            <w:tcMar>
-              <w:top w:type="dxa" w:w="60"/>
-              <w:left w:type="dxa" w:w="100"/>
-              <w:bottom w:type="dxa" w:w="60"/>
-              <w:right w:type="dxa" w:w="100"/>
-            </w:tcMar>
-          </w:tcPr>
-          <w:p>
-            <w:r>
-              <w:rPr>
-                <w:b w:val="false"/>
-                <w:bCs w:val="false"/>
-                <w:color w:val="000000"/>
-                <w:sz w:val="18"/>
-                <w:szCs w:val="18"/>
-              </w:rPr>
-              <w:t xml:space="preserve">Repository created and committed</w:t>
-            </w:r>
-          </w:p>
-        </w:tc>
-        <w:tc>
-          <w:tcPr>
-            <w:tcW w:type="dxa" w:w="4062"/>
+            <w:tcW w:type="dxa" w:w="5235"/>
+            <w:shd w:fill="FFFFFF" w:val="clear"/>
+            <w:tcMar>
+              <w:top w:type="dxa" w:w="60"/>
+              <w:left w:type="dxa" w:w="100"/>
+              <w:bottom w:type="dxa" w:w="60"/>
+              <w:right w:type="dxa" w:w="100"/>
+            </w:tcMar>
+          </w:tcPr>
+          <w:p>
+            <w:r>
+              <w:rPr>
+                <w:b w:val="false"/>
+                <w:bCs w:val="false"/>
+                <w:color w:val="000000"/>
+                <w:sz w:val="18"/>
+                <w:szCs w:val="18"/>
+              </w:rPr>
+              <w:t xml:space="preserve">Topology diagram</w:t>
+            </w:r>
+          </w:p>
+        </w:tc>
+        <w:tc>
+          <w:tcPr>
+            <w:tcW w:type="dxa" w:w="3791"/>
             <w:shd w:fill="FFFFFF" w:val="clear"/>
             <w:tcMar>
               <w:top w:type="dxa" w:w="60"/>
@@ -7426,31 +7673,31 @@
       <w:tr>
         <w:tc>
           <w:tcPr>
-            <w:tcW w:type="dxa" w:w="4964"/>
-            <w:shd w:fill="FFFFFF" w:val="clear"/>
-            <w:tcMar>
-              <w:top w:type="dxa" w:w="60"/>
-              <w:left w:type="dxa" w:w="100"/>
-              <w:bottom w:type="dxa" w:w="60"/>
-              <w:right w:type="dxa" w:w="100"/>
-            </w:tcMar>
-          </w:tcPr>
-          <w:p>
-            <w:r>
-              <w:rPr>
-                <w:b w:val="false"/>
-                <w:bCs w:val="false"/>
-                <w:color w:val="000000"/>
-                <w:sz w:val="18"/>
-                <w:szCs w:val="18"/>
-              </w:rPr>
-              <w:t xml:space="preserve">Pushed to GitHub, remote HEAD verified</w:t>
-            </w:r>
-          </w:p>
-        </w:tc>
-        <w:tc>
-          <w:tcPr>
-            <w:tcW w:type="dxa" w:w="4062"/>
+            <w:tcW w:type="dxa" w:w="5235"/>
+            <w:shd w:fill="FFFFFF" w:val="clear"/>
+            <w:tcMar>
+              <w:top w:type="dxa" w:w="60"/>
+              <w:left w:type="dxa" w:w="100"/>
+              <w:bottom w:type="dxa" w:w="60"/>
+              <w:right w:type="dxa" w:w="100"/>
+            </w:tcMar>
+          </w:tcPr>
+          <w:p>
+            <w:r>
+              <w:rPr>
+                <w:b w:val="false"/>
+                <w:bCs w:val="false"/>
+                <w:color w:val="000000"/>
+                <w:sz w:val="18"/>
+                <w:szCs w:val="18"/>
+              </w:rPr>
+              <w:t xml:space="preserve">Device list and VLAN table</w:t>
+            </w:r>
+          </w:p>
+        </w:tc>
+        <w:tc>
+          <w:tcPr>
+            <w:tcW w:type="dxa" w:w="3791"/>
             <w:shd w:fill="FFFFFF" w:val="clear"/>
             <w:tcMar>
               <w:top w:type="dxa" w:w="60"/>
@@ -7476,31 +7723,31 @@
       <w:tr>
         <w:tc>
           <w:tcPr>
-            <w:tcW w:type="dxa" w:w="4964"/>
-            <w:shd w:fill="FFFFFF" w:val="clear"/>
-            <w:tcMar>
-              <w:top w:type="dxa" w:w="60"/>
-              <w:left w:type="dxa" w:w="100"/>
-              <w:bottom w:type="dxa" w:w="60"/>
-              <w:right w:type="dxa" w:w="100"/>
-            </w:tcMar>
-          </w:tcPr>
-          <w:p>
-            <w:r>
-              <w:rPr>
-                <w:b w:val="false"/>
-                <w:bCs w:val="false"/>
-                <w:color w:val="000000"/>
-                <w:sz w:val="18"/>
-                <w:szCs w:val="18"/>
-              </w:rPr>
-              <w:t xml:space="preserve">All 10 device configurations written</w:t>
-            </w:r>
-          </w:p>
-        </w:tc>
-        <w:tc>
-          <w:tcPr>
-            <w:tcW w:type="dxa" w:w="4062"/>
+            <w:tcW w:type="dxa" w:w="5235"/>
+            <w:shd w:fill="FFFFFF" w:val="clear"/>
+            <w:tcMar>
+              <w:top w:type="dxa" w:w="60"/>
+              <w:left w:type="dxa" w:w="100"/>
+              <w:bottom w:type="dxa" w:w="60"/>
+              <w:right w:type="dxa" w:w="100"/>
+            </w:tcMar>
+          </w:tcPr>
+          <w:p>
+            <w:r>
+              <w:rPr>
+                <w:b w:val="false"/>
+                <w:bCs w:val="false"/>
+                <w:color w:val="000000"/>
+                <w:sz w:val="18"/>
+                <w:szCs w:val="18"/>
+              </w:rPr>
+              <w:t xml:space="preserve">IP addressing table</w:t>
+            </w:r>
+          </w:p>
+        </w:tc>
+        <w:tc>
+          <w:tcPr>
+            <w:tcW w:type="dxa" w:w="3791"/>
             <w:shd w:fill="FFFFFF" w:val="clear"/>
             <w:tcMar>
               <w:top w:type="dxa" w:w="60"/>
@@ -7526,31 +7773,31 @@
       <w:tr>
         <w:tc>
           <w:tcPr>
-            <w:tcW w:type="dxa" w:w="4964"/>
-            <w:shd w:fill="FFFFFF" w:val="clear"/>
-            <w:tcMar>
-              <w:top w:type="dxa" w:w="60"/>
-              <w:left w:type="dxa" w:w="100"/>
-              <w:bottom w:type="dxa" w:w="60"/>
-              <w:right w:type="dxa" w:w="100"/>
-            </w:tcMar>
-          </w:tcPr>
-          <w:p>
-            <w:r>
-              <w:rPr>
-                <w:b w:val="false"/>
-                <w:bCs w:val="false"/>
-                <w:color w:val="000000"/>
-                <w:sz w:val="18"/>
-                <w:szCs w:val="18"/>
-              </w:rPr>
-              <w:t xml:space="preserve">All documentation written</w:t>
-            </w:r>
-          </w:p>
-        </w:tc>
-        <w:tc>
-          <w:tcPr>
-            <w:tcW w:type="dxa" w:w="4062"/>
+            <w:tcW w:type="dxa" w:w="5235"/>
+            <w:shd w:fill="FFFFFF" w:val="clear"/>
+            <w:tcMar>
+              <w:top w:type="dxa" w:w="60"/>
+              <w:left w:type="dxa" w:w="100"/>
+              <w:bottom w:type="dxa" w:w="60"/>
+              <w:right w:type="dxa" w:w="100"/>
+            </w:tcMar>
+          </w:tcPr>
+          <w:p>
+            <w:r>
+              <w:rPr>
+                <w:b w:val="false"/>
+                <w:bCs w:val="false"/>
+                <w:color w:val="000000"/>
+                <w:sz w:val="18"/>
+                <w:szCs w:val="18"/>
+              </w:rPr>
+              <w:t xml:space="preserve">Cable and connection list</w:t>
+            </w:r>
+          </w:p>
+        </w:tc>
+        <w:tc>
+          <w:tcPr>
+            <w:tcW w:type="dxa" w:w="3791"/>
             <w:shd w:fill="FFFFFF" w:val="clear"/>
             <w:tcMar>
               <w:top w:type="dxa" w:w="60"/>
@@ -7576,49 +7823,49 @@
       <w:tr>
         <w:tc>
           <w:tcPr>
-            <w:tcW w:type="dxa" w:w="4964"/>
-            <w:shd w:fill="FFFFFF" w:val="clear"/>
-            <w:tcMar>
-              <w:top w:type="dxa" w:w="60"/>
-              <w:left w:type="dxa" w:w="100"/>
-              <w:bottom w:type="dxa" w:w="60"/>
-              <w:right w:type="dxa" w:w="100"/>
-            </w:tcMar>
-          </w:tcPr>
-          <w:p>
-            <w:r>
-              <w:rPr>
-                <w:b w:val="false"/>
-                <w:bCs w:val="false"/>
-                <w:color w:val="000000"/>
-                <w:sz w:val="18"/>
-                <w:szCs w:val="18"/>
-              </w:rPr>
-              <w:t xml:space="preserve">Web portal pages written</w:t>
-            </w:r>
-          </w:p>
-        </w:tc>
-        <w:tc>
-          <w:tcPr>
-            <w:tcW w:type="dxa" w:w="4062"/>
-            <w:shd w:fill="FFFFFF" w:val="clear"/>
-            <w:tcMar>
-              <w:top w:type="dxa" w:w="60"/>
-              <w:left w:type="dxa" w:w="100"/>
-              <w:bottom w:type="dxa" w:w="60"/>
-              <w:right w:type="dxa" w:w="100"/>
-            </w:tcMar>
-          </w:tcPr>
-          <w:p>
-            <w:r>
-              <w:rPr>
-                <w:b w:val="false"/>
-                <w:bCs w:val="false"/>
-                <w:color w:val="000000"/>
-                <w:sz w:val="18"/>
-                <w:szCs w:val="18"/>
-              </w:rPr>
-              <w:t xml:space="preserve">Complete</w:t>
+            <w:tcW w:type="dxa" w:w="5235"/>
+            <w:shd w:fill="FFFFFF" w:val="clear"/>
+            <w:tcMar>
+              <w:top w:type="dxa" w:w="60"/>
+              <w:left w:type="dxa" w:w="100"/>
+              <w:bottom w:type="dxa" w:w="60"/>
+              <w:right w:type="dxa" w:w="100"/>
+            </w:tcMar>
+          </w:tcPr>
+          <w:p>
+            <w:r>
+              <w:rPr>
+                <w:b w:val="false"/>
+                <w:bCs w:val="false"/>
+                <w:color w:val="000000"/>
+                <w:sz w:val="18"/>
+                <w:szCs w:val="18"/>
+              </w:rPr>
+              <w:t xml:space="preserve">Router configuration</w:t>
+            </w:r>
+          </w:p>
+        </w:tc>
+        <w:tc>
+          <w:tcPr>
+            <w:tcW w:type="dxa" w:w="3791"/>
+            <w:shd w:fill="FFFFFF" w:val="clear"/>
+            <w:tcMar>
+              <w:top w:type="dxa" w:w="60"/>
+              <w:left w:type="dxa" w:w="100"/>
+              <w:bottom w:type="dxa" w:w="60"/>
+              <w:right w:type="dxa" w:w="100"/>
+            </w:tcMar>
+          </w:tcPr>
+          <w:p>
+            <w:r>
+              <w:rPr>
+                <w:b w:val="false"/>
+                <w:bCs w:val="false"/>
+                <w:color w:val="000000"/>
+                <w:sz w:val="18"/>
+                <w:szCs w:val="18"/>
+              </w:rPr>
+              <w:t xml:space="preserve">Complete, applied and verified</w:t>
             </w:r>
           </w:p>
         </w:tc>
@@ -7626,49 +7873,49 @@
       <w:tr>
         <w:tc>
           <w:tcPr>
-            <w:tcW w:type="dxa" w:w="4964"/>
-            <w:shd w:fill="FFFFFF" w:val="clear"/>
-            <w:tcMar>
-              <w:top w:type="dxa" w:w="60"/>
-              <w:left w:type="dxa" w:w="100"/>
-              <w:bottom w:type="dxa" w:w="60"/>
-              <w:right w:type="dxa" w:w="100"/>
-            </w:tcMar>
-          </w:tcPr>
-          <w:p>
-            <w:r>
-              <w:rPr>
-                <w:b w:val="false"/>
-                <w:bCs w:val="false"/>
-                <w:color w:val="000000"/>
-                <w:sz w:val="18"/>
-                <w:szCs w:val="18"/>
-              </w:rPr>
-              <w:t xml:space="preserve">Cross-file consistency audit</w:t>
-            </w:r>
-          </w:p>
-        </w:tc>
-        <w:tc>
-          <w:tcPr>
-            <w:tcW w:type="dxa" w:w="4062"/>
-            <w:shd w:fill="FFFFFF" w:val="clear"/>
-            <w:tcMar>
-              <w:top w:type="dxa" w:w="60"/>
-              <w:left w:type="dxa" w:w="100"/>
-              <w:bottom w:type="dxa" w:w="60"/>
-              <w:right w:type="dxa" w:w="100"/>
-            </w:tcMar>
-          </w:tcPr>
-          <w:p>
-            <w:r>
-              <w:rPr>
-                <w:b w:val="false"/>
-                <w:bCs w:val="false"/>
-                <w:color w:val="000000"/>
-                <w:sz w:val="18"/>
-                <w:szCs w:val="18"/>
-              </w:rPr>
-              <w:t xml:space="preserve">Complete, one issue found and fixed</w:t>
+            <w:tcW w:type="dxa" w:w="5235"/>
+            <w:shd w:fill="FFFFFF" w:val="clear"/>
+            <w:tcMar>
+              <w:top w:type="dxa" w:w="60"/>
+              <w:left w:type="dxa" w:w="100"/>
+              <w:bottom w:type="dxa" w:w="60"/>
+              <w:right w:type="dxa" w:w="100"/>
+            </w:tcMar>
+          </w:tcPr>
+          <w:p>
+            <w:r>
+              <w:rPr>
+                <w:b w:val="false"/>
+                <w:bCs w:val="false"/>
+                <w:color w:val="000000"/>
+                <w:sz w:val="18"/>
+                <w:szCs w:val="18"/>
+              </w:rPr>
+              <w:t xml:space="preserve">Nine switch configurations</w:t>
+            </w:r>
+          </w:p>
+        </w:tc>
+        <w:tc>
+          <w:tcPr>
+            <w:tcW w:type="dxa" w:w="3791"/>
+            <w:shd w:fill="FFFFFF" w:val="clear"/>
+            <w:tcMar>
+              <w:top w:type="dxa" w:w="60"/>
+              <w:left w:type="dxa" w:w="100"/>
+              <w:bottom w:type="dxa" w:w="60"/>
+              <w:right w:type="dxa" w:w="100"/>
+            </w:tcMar>
+          </w:tcPr>
+          <w:p>
+            <w:r>
+              <w:rPr>
+                <w:b w:val="false"/>
+                <w:bCs w:val="false"/>
+                <w:color w:val="000000"/>
+                <w:sz w:val="18"/>
+                <w:szCs w:val="18"/>
+              </w:rPr>
+              <w:t xml:space="preserve">Complete, applied and verified</w:t>
             </w:r>
           </w:p>
         </w:tc>
@@ -7676,49 +7923,49 @@
       <w:tr>
         <w:tc>
           <w:tcPr>
-            <w:tcW w:type="dxa" w:w="4964"/>
-            <w:shd w:fill="FFFFFF" w:val="clear"/>
-            <w:tcMar>
-              <w:top w:type="dxa" w:w="60"/>
-              <w:left w:type="dxa" w:w="100"/>
-              <w:bottom w:type="dxa" w:w="60"/>
-              <w:right w:type="dxa" w:w="100"/>
-            </w:tcMar>
-          </w:tcPr>
-          <w:p>
-            <w:r>
-              <w:rPr>
-                <w:b w:val="false"/>
-                <w:bCs w:val="false"/>
-                <w:color w:val="000000"/>
-                <w:sz w:val="18"/>
-                <w:szCs w:val="18"/>
-              </w:rPr>
-              <w:t xml:space="preserve">Packet Tracer simulation (.pkt)</w:t>
-            </w:r>
-          </w:p>
-        </w:tc>
-        <w:tc>
-          <w:tcPr>
-            <w:tcW w:type="dxa" w:w="4062"/>
-            <w:shd w:fill="FFFFFF" w:val="clear"/>
-            <w:tcMar>
-              <w:top w:type="dxa" w:w="60"/>
-              <w:left w:type="dxa" w:w="100"/>
-              <w:bottom w:type="dxa" w:w="60"/>
-              <w:right w:type="dxa" w:w="100"/>
-            </w:tcMar>
-          </w:tcPr>
-          <w:p>
-            <w:r>
-              <w:rPr>
-                <w:b w:val="false"/>
-                <w:bCs w:val="false"/>
-                <w:color w:val="000000"/>
-                <w:sz w:val="18"/>
-                <w:szCs w:val="18"/>
-              </w:rPr>
-              <w:t xml:space="preserve">NOT BUILT</w:t>
+            <w:tcW w:type="dxa" w:w="5235"/>
+            <w:shd w:fill="FFFFFF" w:val="clear"/>
+            <w:tcMar>
+              <w:top w:type="dxa" w:w="60"/>
+              <w:left w:type="dxa" w:w="100"/>
+              <w:bottom w:type="dxa" w:w="60"/>
+              <w:right w:type="dxa" w:w="100"/>
+            </w:tcMar>
+          </w:tcPr>
+          <w:p>
+            <w:r>
+              <w:rPr>
+                <w:b w:val="false"/>
+                <w:bCs w:val="false"/>
+                <w:color w:val="000000"/>
+                <w:sz w:val="18"/>
+                <w:szCs w:val="18"/>
+              </w:rPr>
+              <w:t xml:space="preserve">PC and server setup</w:t>
+            </w:r>
+          </w:p>
+        </w:tc>
+        <w:tc>
+          <w:tcPr>
+            <w:tcW w:type="dxa" w:w="3791"/>
+            <w:shd w:fill="FFFFFF" w:val="clear"/>
+            <w:tcMar>
+              <w:top w:type="dxa" w:w="60"/>
+              <w:left w:type="dxa" w:w="100"/>
+              <w:bottom w:type="dxa" w:w="60"/>
+              <w:right w:type="dxa" w:w="100"/>
+            </w:tcMar>
+          </w:tcPr>
+          <w:p>
+            <w:r>
+              <w:rPr>
+                <w:b w:val="false"/>
+                <w:bCs w:val="false"/>
+                <w:color w:val="000000"/>
+                <w:sz w:val="18"/>
+                <w:szCs w:val="18"/>
+              </w:rPr>
+              <w:t xml:space="preserve">Complete, applied and verified</w:t>
             </w:r>
           </w:p>
         </w:tc>
@@ -7726,49 +7973,49 @@
       <w:tr>
         <w:tc>
           <w:tcPr>
-            <w:tcW w:type="dxa" w:w="4964"/>
-            <w:shd w:fill="FFFFFF" w:val="clear"/>
-            <w:tcMar>
-              <w:top w:type="dxa" w:w="60"/>
-              <w:left w:type="dxa" w:w="100"/>
-              <w:bottom w:type="dxa" w:w="60"/>
-              <w:right w:type="dxa" w:w="100"/>
-            </w:tcMar>
-          </w:tcPr>
-          <w:p>
-            <w:r>
-              <w:rPr>
-                <w:b w:val="false"/>
-                <w:bCs w:val="false"/>
-                <w:color w:val="000000"/>
-                <w:sz w:val="18"/>
-                <w:szCs w:val="18"/>
-              </w:rPr>
-              <w:t xml:space="preserve">Configurations parsed by a live Cisco IOS image</w:t>
-            </w:r>
-          </w:p>
-        </w:tc>
-        <w:tc>
-          <w:tcPr>
-            <w:tcW w:type="dxa" w:w="4062"/>
-            <w:shd w:fill="FFFFFF" w:val="clear"/>
-            <w:tcMar>
-              <w:top w:type="dxa" w:w="60"/>
-              <w:left w:type="dxa" w:w="100"/>
-              <w:bottom w:type="dxa" w:w="60"/>
-              <w:right w:type="dxa" w:w="100"/>
-            </w:tcMar>
-          </w:tcPr>
-          <w:p>
-            <w:r>
-              <w:rPr>
-                <w:b w:val="false"/>
-                <w:bCs w:val="false"/>
-                <w:color w:val="000000"/>
-                <w:sz w:val="18"/>
-                <w:szCs w:val="18"/>
-              </w:rPr>
-              <w:t xml:space="preserve">NOT YET VERIFIED</w:t>
+            <w:tcW w:type="dxa" w:w="5235"/>
+            <w:shd w:fill="FFFFFF" w:val="clear"/>
+            <w:tcMar>
+              <w:top w:type="dxa" w:w="60"/>
+              <w:left w:type="dxa" w:w="100"/>
+              <w:bottom w:type="dxa" w:w="60"/>
+              <w:right w:type="dxa" w:w="100"/>
+            </w:tcMar>
+          </w:tcPr>
+          <w:p>
+            <w:r>
+              <w:rPr>
+                <w:b w:val="false"/>
+                <w:bCs w:val="false"/>
+                <w:color w:val="000000"/>
+                <w:sz w:val="18"/>
+                <w:szCs w:val="18"/>
+              </w:rPr>
+              <w:t xml:space="preserve">Testing plan, eighteen tests</w:t>
+            </w:r>
+          </w:p>
+        </w:tc>
+        <w:tc>
+          <w:tcPr>
+            <w:tcW w:type="dxa" w:w="3791"/>
+            <w:shd w:fill="FFFFFF" w:val="clear"/>
+            <w:tcMar>
+              <w:top w:type="dxa" w:w="60"/>
+              <w:left w:type="dxa" w:w="100"/>
+              <w:bottom w:type="dxa" w:w="60"/>
+              <w:right w:type="dxa" w:w="100"/>
+            </w:tcMar>
+          </w:tcPr>
+          <w:p>
+            <w:r>
+              <w:rPr>
+                <w:b w:val="false"/>
+                <w:bCs w:val="false"/>
+                <w:color w:val="000000"/>
+                <w:sz w:val="18"/>
+                <w:szCs w:val="18"/>
+              </w:rPr>
+              <w:t xml:space="preserve">Complete</w:t>
             </w:r>
           </w:p>
         </w:tc>
@@ -7776,49 +8023,249 @@
       <w:tr>
         <w:tc>
           <w:tcPr>
-            <w:tcW w:type="dxa" w:w="4964"/>
-            <w:shd w:fill="FFFFFF" w:val="clear"/>
-            <w:tcMar>
-              <w:top w:type="dxa" w:w="60"/>
-              <w:left w:type="dxa" w:w="100"/>
-              <w:bottom w:type="dxa" w:w="60"/>
-              <w:right w:type="dxa" w:w="100"/>
-            </w:tcMar>
-          </w:tcPr>
-          <w:p>
-            <w:r>
-              <w:rPr>
-                <w:b w:val="false"/>
-                <w:bCs w:val="false"/>
-                <w:color w:val="000000"/>
-                <w:sz w:val="18"/>
-                <w:szCs w:val="18"/>
-              </w:rPr>
-              <w:t xml:space="preserve">Eighteen-test verification pass</w:t>
-            </w:r>
-          </w:p>
-        </w:tc>
-        <w:tc>
-          <w:tcPr>
-            <w:tcW w:type="dxa" w:w="4062"/>
-            <w:shd w:fill="FFFFFF" w:val="clear"/>
-            <w:tcMar>
-              <w:top w:type="dxa" w:w="60"/>
-              <w:left w:type="dxa" w:w="100"/>
-              <w:bottom w:type="dxa" w:w="60"/>
-              <w:right w:type="dxa" w:w="100"/>
-            </w:tcMar>
-          </w:tcPr>
-          <w:p>
-            <w:r>
-              <w:rPr>
-                <w:b w:val="false"/>
-                <w:bCs w:val="false"/>
-                <w:color w:val="000000"/>
-                <w:sz w:val="18"/>
-                <w:szCs w:val="18"/>
-              </w:rPr>
-              <w:t xml:space="preserve">NOT YET RUN</w:t>
+            <w:tcW w:type="dxa" w:w="5235"/>
+            <w:shd w:fill="FFFFFF" w:val="clear"/>
+            <w:tcMar>
+              <w:top w:type="dxa" w:w="60"/>
+              <w:left w:type="dxa" w:w="100"/>
+              <w:bottom w:type="dxa" w:w="60"/>
+              <w:right w:type="dxa" w:w="100"/>
+            </w:tcMar>
+          </w:tcPr>
+          <w:p>
+            <w:r>
+              <w:rPr>
+                <w:b w:val="false"/>
+                <w:bCs w:val="false"/>
+                <w:color w:val="000000"/>
+                <w:sz w:val="18"/>
+                <w:szCs w:val="18"/>
+              </w:rPr>
+              <w:t xml:space="preserve">Troubleshooting, twelve symptoms</w:t>
+            </w:r>
+          </w:p>
+        </w:tc>
+        <w:tc>
+          <w:tcPr>
+            <w:tcW w:type="dxa" w:w="3791"/>
+            <w:shd w:fill="FFFFFF" w:val="clear"/>
+            <w:tcMar>
+              <w:top w:type="dxa" w:w="60"/>
+              <w:left w:type="dxa" w:w="100"/>
+              <w:bottom w:type="dxa" w:w="60"/>
+              <w:right w:type="dxa" w:w="100"/>
+            </w:tcMar>
+          </w:tcPr>
+          <w:p>
+            <w:r>
+              <w:rPr>
+                <w:b w:val="false"/>
+                <w:bCs w:val="false"/>
+                <w:color w:val="000000"/>
+                <w:sz w:val="18"/>
+                <w:szCs w:val="18"/>
+              </w:rPr>
+              <w:t xml:space="preserve">Complete</w:t>
+            </w:r>
+          </w:p>
+        </w:tc>
+      </w:tr>
+      <w:tr>
+        <w:tc>
+          <w:tcPr>
+            <w:tcW w:type="dxa" w:w="5235"/>
+            <w:shd w:fill="FFFFFF" w:val="clear"/>
+            <w:tcMar>
+              <w:top w:type="dxa" w:w="60"/>
+              <w:left w:type="dxa" w:w="100"/>
+              <w:bottom w:type="dxa" w:w="60"/>
+              <w:right w:type="dxa" w:w="100"/>
+            </w:tcMar>
+          </w:tcPr>
+          <w:p>
+            <w:r>
+              <w:rPr>
+                <w:b w:val="false"/>
+                <w:bCs w:val="false"/>
+                <w:color w:val="000000"/>
+                <w:sz w:val="18"/>
+                <w:szCs w:val="18"/>
+              </w:rPr>
+              <w:t xml:space="preserve">Build checklist</w:t>
+            </w:r>
+          </w:p>
+        </w:tc>
+        <w:tc>
+          <w:tcPr>
+            <w:tcW w:type="dxa" w:w="3791"/>
+            <w:shd w:fill="FFFFFF" w:val="clear"/>
+            <w:tcMar>
+              <w:top w:type="dxa" w:w="60"/>
+              <w:left w:type="dxa" w:w="100"/>
+              <w:bottom w:type="dxa" w:w="60"/>
+              <w:right w:type="dxa" w:w="100"/>
+            </w:tcMar>
+          </w:tcPr>
+          <w:p>
+            <w:r>
+              <w:rPr>
+                <w:b w:val="false"/>
+                <w:bCs w:val="false"/>
+                <w:color w:val="000000"/>
+                <w:sz w:val="18"/>
+                <w:szCs w:val="18"/>
+              </w:rPr>
+              <w:t xml:space="preserve">Complete</w:t>
+            </w:r>
+          </w:p>
+        </w:tc>
+      </w:tr>
+      <w:tr>
+        <w:tc>
+          <w:tcPr>
+            <w:tcW w:type="dxa" w:w="5235"/>
+            <w:shd w:fill="FFFFFF" w:val="clear"/>
+            <w:tcMar>
+              <w:top w:type="dxa" w:w="60"/>
+              <w:left w:type="dxa" w:w="100"/>
+              <w:bottom w:type="dxa" w:w="60"/>
+              <w:right w:type="dxa" w:w="100"/>
+            </w:tcMar>
+          </w:tcPr>
+          <w:p>
+            <w:r>
+              <w:rPr>
+                <w:b w:val="false"/>
+                <w:bCs w:val="false"/>
+                <w:color w:val="000000"/>
+                <w:sz w:val="18"/>
+                <w:szCs w:val="18"/>
+              </w:rPr>
+              <w:t xml:space="preserve">Portability notes and git workflow</w:t>
+            </w:r>
+          </w:p>
+        </w:tc>
+        <w:tc>
+          <w:tcPr>
+            <w:tcW w:type="dxa" w:w="3791"/>
+            <w:shd w:fill="FFFFFF" w:val="clear"/>
+            <w:tcMar>
+              <w:top w:type="dxa" w:w="60"/>
+              <w:left w:type="dxa" w:w="100"/>
+              <w:bottom w:type="dxa" w:w="60"/>
+              <w:right w:type="dxa" w:w="100"/>
+            </w:tcMar>
+          </w:tcPr>
+          <w:p>
+            <w:r>
+              <w:rPr>
+                <w:b w:val="false"/>
+                <w:bCs w:val="false"/>
+                <w:color w:val="000000"/>
+                <w:sz w:val="18"/>
+                <w:szCs w:val="18"/>
+              </w:rPr>
+              <w:t xml:space="preserve">Complete</w:t>
+            </w:r>
+          </w:p>
+        </w:tc>
+      </w:tr>
+      <w:tr>
+        <w:tc>
+          <w:tcPr>
+            <w:tcW w:type="dxa" w:w="5235"/>
+            <w:shd w:fill="FFFFFF" w:val="clear"/>
+            <w:tcMar>
+              <w:top w:type="dxa" w:w="60"/>
+              <w:left w:type="dxa" w:w="100"/>
+              <w:bottom w:type="dxa" w:w="60"/>
+              <w:right w:type="dxa" w:w="100"/>
+            </w:tcMar>
+          </w:tcPr>
+          <w:p>
+            <w:r>
+              <w:rPr>
+                <w:b w:val="false"/>
+                <w:bCs w:val="false"/>
+                <w:color w:val="000000"/>
+                <w:sz w:val="18"/>
+                <w:szCs w:val="18"/>
+              </w:rPr>
+              <w:t xml:space="preserve">Packet Tracer simulation file</w:t>
+            </w:r>
+          </w:p>
+        </w:tc>
+        <w:tc>
+          <w:tcPr>
+            <w:tcW w:type="dxa" w:w="3791"/>
+            <w:shd w:fill="FFFFFF" w:val="clear"/>
+            <w:tcMar>
+              <w:top w:type="dxa" w:w="60"/>
+              <w:left w:type="dxa" w:w="100"/>
+              <w:bottom w:type="dxa" w:w="60"/>
+              <w:right w:type="dxa" w:w="100"/>
+            </w:tcMar>
+          </w:tcPr>
+          <w:p>
+            <w:r>
+              <w:rPr>
+                <w:b w:val="false"/>
+                <w:bCs w:val="false"/>
+                <w:color w:val="000000"/>
+                <w:sz w:val="18"/>
+                <w:szCs w:val="18"/>
+              </w:rPr>
+              <w:t xml:space="preserve">Built on PT 9.0.1, committed and pushed</w:t>
+            </w:r>
+          </w:p>
+        </w:tc>
+      </w:tr>
+      <w:tr>
+        <w:tc>
+          <w:tcPr>
+            <w:tcW w:type="dxa" w:w="5235"/>
+            <w:shd w:fill="FFFFFF" w:val="clear"/>
+            <w:tcMar>
+              <w:top w:type="dxa" w:w="60"/>
+              <w:left w:type="dxa" w:w="100"/>
+              <w:bottom w:type="dxa" w:w="60"/>
+              <w:right w:type="dxa" w:w="100"/>
+            </w:tcMar>
+          </w:tcPr>
+          <w:p>
+            <w:r>
+              <w:rPr>
+                <w:b w:val="false"/>
+                <w:bCs w:val="false"/>
+                <w:color w:val="000000"/>
+                <w:sz w:val="18"/>
+                <w:szCs w:val="18"/>
+              </w:rPr>
+              <w:t xml:space="preserve">Repository published to GitHub</w:t>
+            </w:r>
+          </w:p>
+        </w:tc>
+        <w:tc>
+          <w:tcPr>
+            <w:tcW w:type="dxa" w:w="3791"/>
+            <w:shd w:fill="FFFFFF" w:val="clear"/>
+            <w:tcMar>
+              <w:top w:type="dxa" w:w="60"/>
+              <w:left w:type="dxa" w:w="100"/>
+              <w:bottom w:type="dxa" w:w="60"/>
+              <w:right w:type="dxa" w:w="100"/>
+            </w:tcMar>
+          </w:tcPr>
+          <w:p>
+            <w:r>
+              <w:rPr>
+                <w:b w:val="false"/>
+                <w:bCs w:val="false"/>
+                <w:color w:val="000000"/>
+                <w:sz w:val="18"/>
+                <w:szCs w:val="18"/>
+              </w:rPr>
+              <w:t xml:space="preserve">Complete, remote head verified</w:t>
             </w:r>
           </w:p>
         </w:tc>
@@ -7835,12 +8282,19 @@
       </w:pPr>
       <w:r>
         <w:rPr>
-          <w:b/>
-          <w:bCs/>
-          <w:sz w:val="21"/>
-          <w:szCs w:val="21"/>
-        </w:rPr>
-        <w:t xml:space="preserve">The three items marked as outstanding are the same single task.</w:t>
+          <w:sz w:val="21"/>
+          <w:szCs w:val="21"/>
+        </w:rPr>
+        <w:t xml:space="preserve">The simulation file is self-contained. It carries the forty-nine devices, the forty-eight cables, all ten saved device configurations, the three servers with their static addresses and services, the five DNS records, both portal pages, the FTP user and every PC's DHCP setting. Opening it on another machine reproduces the finished network with no reconfiguration required.</w:t>
+      </w:r>
+    </w:p>
+    <w:p>
+      <w:pPr>
+        <w:pStyle w:val="Heading2"/>
+        <w:spacing w:after="120" w:before="280"/>
+      </w:pPr>
+      <w:r>
+        <w:t xml:space="preserve">10.1 Verification performed</w:t>
       </w:r>
     </w:p>
     <w:p>
@@ -7852,40 +8306,7 @@
           <w:sz w:val="21"/>
           <w:szCs w:val="21"/>
         </w:rPr>
-        <w:t xml:space="preserve">Everything written so far is a blueprint. The simulation itself is built by hand in the Packet Tracer GUI, which is a drag-and-drop task that cannot be automated from outside the application. A .pkt file is a proprietary compressed binary; hand-authoring its internal XML for a specific Packet Tracer build is not reliable, and a malformed file fails to open with no useful diagnostic. Producing it was therefore left as a manual step rather than attempted and half-delivered.</w:t>
-      </w:r>
-    </w:p>
-    <w:p>
-      <w:pPr>
-        <w:spacing w:after="120" w:line="276"/>
-      </w:pPr>
-      <w:r>
-        <w:rPr>
-          <w:sz w:val="21"/>
-          <w:szCs w:val="21"/>
-        </w:rPr>
-        <w:t xml:space="preserve">The configurations have been checked for internal consistency and against Cisco IOS syntax, but they have not been fed to an actual IOS parser. Until the first switch is configured and the paste is accepted without error, they should be regarded as carefully constructed rather than proven. The eight access switches share one template, so if the first one pastes cleanly the remaining seven will too.</w:t>
-      </w:r>
-    </w:p>
-    <w:p>
-      <w:pPr>
-        <w:pStyle w:val="Heading1"/>
-        <w:spacing w:after="160" w:before="360"/>
-      </w:pPr>
-      <w:r>
-        <w:t xml:space="preserve">11. Next Steps</w:t>
-      </w:r>
-    </w:p>
-    <w:p>
-      <w:pPr>
-        <w:spacing w:after="120" w:line="276"/>
-      </w:pPr>
-      <w:r>
-        <w:rPr>
-          <w:sz w:val="21"/>
-          <w:szCs w:val="21"/>
-        </w:rPr>
-        <w:t xml:space="preserve">In order. The first item unblocks everything else.</w:t>
+        <w:t xml:space="preserve">The build was checked at each stage rather than only at the end.</w:t>
       </w:r>
     </w:p>
     <w:p>
@@ -7902,7 +8323,7 @@
           <w:sz w:val="21"/>
           <w:szCs w:val="21"/>
         </w:rPr>
-        <w:t xml:space="preserve">Build the simulation by following docs/build-checklist.md. Place 49 devices with the exact names used throughout the repository, run 48 cables, then paste the ten configuration files. Budget 60 to 90 minutes for a first build.</w:t>
+        <w:t xml:space="preserve">Router subinterfaces reached up and up once the distribution trunk came online</w:t>
       </w:r>
     </w:p>
     <w:p>
@@ -7919,7 +8340,7 @@
           <w:sz w:val="21"/>
           <w:szCs w:val="21"/>
         </w:rPr>
-        <w:t xml:space="preserve">Configure the three servers and the thirty-six PCs through the GUI, following docs/pc-server-setup.md. Static addresses and services on the servers, DHCP on the PCs.</w:t>
+        <w:t xml:space="preserve">Nine connected and nine local routes present in the routing table</w:t>
       </w:r>
     </w:p>
     <w:p>
@@ -7936,7 +8357,7 @@
           <w:sz w:val="21"/>
           <w:szCs w:val="21"/>
         </w:rPr>
-        <w:t xml:space="preserve">Paste web/index.html into the HTTP index page of SRV-WEB, and web/portal.html into SRV-APP.</w:t>
+        <w:t xml:space="preserve">Nine trunks confirmed, with native VLAN 99 on every line</w:t>
       </w:r>
     </w:p>
     <w:p>
@@ -7953,7 +8374,7 @@
           <w:sz w:val="21"/>
           <w:szCs w:val="21"/>
         </w:rPr>
-        <w:t xml:space="preserve">Run the eighteen tests in docs/testing-results.md and fill in the recording sheet.</w:t>
+        <w:t xml:space="preserve">Thirty-six DHCP bindings issued, none below the excluded range, none in the server subnet</w:t>
       </w:r>
     </w:p>
     <w:p>
@@ -7970,7 +8391,7 @@
           <w:sz w:val="21"/>
           <w:szCs w:val="21"/>
         </w:rPr>
-        <w:t xml:space="preserve">Save the file as packet-tracer/university-network.pkt, commit it with the Packet Tracer version in the commit message, and push.</w:t>
+        <w:t xml:space="preserve">Name resolution and end-to-end reachability confirmed by pinging the web server by name</w:t>
       </w:r>
     </w:p>
     <w:p>
@@ -7987,13 +8408,84 @@
           <w:sz w:val="21"/>
           <w:szCs w:val="21"/>
         </w:rPr>
-        <w:t xml:space="preserve">On the second machine, clone the repository outside any cloud-synced folder and open the .pkt. Verify with show ip interface brief on the router and ping www.university.local from any PC.</w:t>
-      </w:r>
-    </w:p>
-    <w:p>
-      <w:pPr>
-        <w:spacing w:after="80"/>
-      </w:pPr>
+        <w:t xml:space="preserve">Both intended ACL denials confirmed as failures, which is the design working as specified</w:t>
+      </w:r>
+    </w:p>
+    <w:p>
+      <w:pPr>
+        <w:pStyle w:val="ListParagraph"/>
+        <w:numPr>
+          <w:ilvl w:val="0"/>
+          <w:numId w:val="2"/>
+        </w:numPr>
+        <w:spacing w:after="80" w:line="276"/>
+      </w:pPr>
+      <w:r>
+        <w:rPr>
+          <w:sz w:val="21"/>
+          <w:szCs w:val="21"/>
+        </w:rPr>
+        <w:t xml:space="preserve">Port security demonstrated by moving a host between ports and observing the violation counter increment while the port remained in the secure-up state</w:t>
+      </w:r>
+    </w:p>
+    <w:p>
+      <w:pPr>
+        <w:pStyle w:val="ListParagraph"/>
+        <w:numPr>
+          <w:ilvl w:val="0"/>
+          <w:numId w:val="2"/>
+        </w:numPr>
+        <w:spacing w:after="80" w:line="276"/>
+      </w:pPr>
+      <w:r>
+        <w:rPr>
+          <w:sz w:val="21"/>
+          <w:szCs w:val="21"/>
+        </w:rPr>
+        <w:t xml:space="preserve">SSH confirmed reachable from the Administration subnet and refused from another subnet</w:t>
+      </w:r>
+    </w:p>
+    <w:p>
+      <w:pPr>
+        <w:pStyle w:val="Heading1"/>
+        <w:spacing w:after="160" w:before="360"/>
+      </w:pPr>
+      <w:r>
+        <w:t xml:space="preserve">11. What Remains</w:t>
+      </w:r>
+    </w:p>
+    <w:p>
+      <w:pPr>
+        <w:spacing w:after="120" w:line="276"/>
+      </w:pPr>
+      <w:r>
+        <w:rPr>
+          <w:sz w:val="21"/>
+          <w:szCs w:val="21"/>
+        </w:rPr>
+        <w:t xml:space="preserve">Nothing in the brief is outstanding. Four optional items remain, listed by how much they matter.</w:t>
+      </w:r>
+    </w:p>
+    <w:p>
+      <w:pPr>
+        <w:pStyle w:val="Heading2"/>
+        <w:spacing w:after="120" w:before="280"/>
+      </w:pPr>
+      <w:r>
+        <w:t xml:space="preserve">11.1 Verify the clone on the second machine</w:t>
+      </w:r>
+    </w:p>
+    <w:p>
+      <w:pPr>
+        <w:spacing w:after="120" w:line="276"/>
+      </w:pPr>
+      <w:r>
+        <w:rPr>
+          <w:sz w:val="21"/>
+          <w:szCs w:val="21"/>
+        </w:rPr>
+        <w:t xml:space="preserve">The repository has not yet been cloned and opened on the laptop. This is the last functional step and takes about ten minutes: clone into a folder outside any cloud-synced directory, open the simulation file, then check the router interface summary and ping the web server by name from any PC.</w:t>
+      </w:r>
     </w:p>
     <w:p>
       <w:pPr>
@@ -8006,7 +8498,7 @@
           <w:sz w:val="21"/>
           <w:szCs w:val="21"/>
         </w:rPr>
-        <w:t xml:space="preserve">Two things that catch almost everyone:</w:t>
+        <w:t xml:space="preserve">One hard prerequisite.</w:t>
       </w:r>
     </w:p>
     <w:p>
@@ -8018,7 +8510,16 @@
           <w:sz w:val="21"/>
           <w:szCs w:val="21"/>
         </w:rPr>
-        <w:t xml:space="preserve">Cable the whole topology before pasting the switch configurations. Port security uses sticky MAC learning, so each port should see the correct device the first time. Moving a PC to a different port after the configuration is saved produces violations that look convincingly like a broken network.</w:t>
+        <w:t xml:space="preserve">The file was saved by Packet Tracer 9.0.1. Compatibility runs one way only: a newer Packet Tracer opens older files, an older one never opens newer files, and the error message does not identify the version as the cause. If the laptop runs anything older, the file must be re-saved down a version from a machine that can already open it, using File then Save As and choosing a lower entry in the Save as type dropdown. That can only be done on the build machine, so it is worth doing before leaving it.</w:t>
+      </w:r>
+    </w:p>
+    <w:p>
+      <w:pPr>
+        <w:pStyle w:val="Heading2"/>
+        <w:spacing w:after="120" w:before="280"/>
+      </w:pPr>
+      <w:r>
+        <w:t xml:space="preserve">11.2 Fill in the test recording sheet</w:t>
       </w:r>
     </w:p>
     <w:p>
@@ -8030,7 +8531,49 @@
           <w:sz w:val="21"/>
           <w:szCs w:val="21"/>
         </w:rPr>
-        <w:t xml:space="preserve">The command crypto key generate rsa is interactive and will stop a bulk paste. When Packet Tracer prints How many bits in the modulus, type 1024, press Enter, then paste the remainder of the file. Every configuration file flags this at the exact point it occurs.</w:t>
+        <w:t xml:space="preserve">The testing document contains a twenty-row pass and fail table that is still blank. The tests were run during the build, but recording the results converts a test plan into test evidence, which is usually what is assessed.</w:t>
+      </w:r>
+    </w:p>
+    <w:p>
+      <w:pPr>
+        <w:pStyle w:val="Heading2"/>
+        <w:spacing w:after="120" w:before="280"/>
+      </w:pPr>
+      <w:r>
+        <w:t xml:space="preserve">11.3 Add screenshots</w:t>
+      </w:r>
+    </w:p>
+    <w:p>
+      <w:pPr>
+        <w:spacing w:after="120" w:line="276"/>
+      </w:pPr>
+      <w:r>
+        <w:rPr>
+          <w:sz w:val="21"/>
+          <w:szCs w:val="21"/>
+        </w:rPr>
+        <w:t xml:space="preserve">The repository contains no screenshots. The five most useful would be the topology canvas, the router interface summary, the trunk summary on the distribution switch, a PC browser showing the portal page, and the port security violation counter after the deliberate violation.</w:t>
+      </w:r>
+    </w:p>
+    <w:p>
+      <w:pPr>
+        <w:pStyle w:val="Heading2"/>
+        <w:spacing w:after="120" w:before="280"/>
+      </w:pPr>
+      <w:r>
+        <w:t xml:space="preserve">11.4 Commit a down-version simulation file</w:t>
+      </w:r>
+    </w:p>
+    <w:p>
+      <w:pPr>
+        <w:spacing w:after="120" w:line="276"/>
+      </w:pPr>
+      <w:r>
+        <w:rPr>
+          <w:sz w:val="21"/>
+          <w:szCs w:val="21"/>
+        </w:rPr>
+        <w:t xml:space="preserve">Saving a second copy in an older Packet Tracer format and committing it alongside the current one removes the version risk permanently, for any machine the project is ever opened on.</w:t>
       </w:r>
     </w:p>
     <w:p>

</xml_diff>